<commit_message>
Update manuscript figures and supplements
</commit_message>
<xml_diff>
--- a/manuscript_material/legends/Figure_legends.docx
+++ b/manuscript_material/legends/Figure_legends.docx
@@ -143,7 +143,7 @@
         <w:t>a</w:t>
       </w:r>
       <w:r>
-        <w:t xml:space="preserve">, Performance by model configuration on each benchmark: IWC mean output agreement over all ten tasks; BixBench-Verified-50 accuracy; CompBioBench reported benchmark scores (open symbols labelled predicted). Symbols are replicate runs; the tick and number give the mean. The superseded Claude Code agent harness ran BixBench-Verified-50 only (Supplementary Tables 55, 58 and 61). </w:t>
+        <w:t xml:space="preserve">, Performance by model configuration on each benchmark, on one percentage axis (70–100%): IWC mean output agreement over all ten tasks, shown as a percentage (0.999 = 99.9%); BixBench-Verified-50 accuracy; CompBioBench reported benchmark scores, answers credited of 100 tasks (open symbols labelled predicted). Symbols are replicate runs; the tick and number give the mean. The superseded Claude Code agent harness ran BixBench-Verified-50 only (Supplementary Tables 55, 58 and 61). </w:t>
       </w:r>
       <w:r>
         <w:rPr>
@@ -152,7 +152,7 @@
         <w:t>b</w:t>
       </w:r>
       <w:r>
-        <w:t xml:space="preserve">, Galaxy-condition runs that requested a user-defined tool, by model configuration. User-defined tools were not offered for IWC tasks (Supplementary Table 24). </w:t>
+        <w:t xml:space="preserve">, Galaxy-condition runs that requested a user-defined tool, by model configuration, with the benchmarks in the order of panel a. User-defined tools were not offered for IWC tasks, so no IWC run requested one (0 of 120 runs; Supplementary Table 24). </w:t>
       </w:r>
       <w:r>
         <w:rPr>
@@ -161,7 +161,7 @@
         <w:t>c</w:t>
       </w:r>
       <w:r>
-        <w:t>, Input-token usage per Galaxy-condition run (millions, log scale). Boxes span the middle 50% of runs and mark the median, which is printed at right; whiskers extend to 1.5 times the interquartile range; outliers are not shown (Supplementary Table 49; Extended Data Fig. 6).</w:t>
+        <w:t>, Input-token usage per Galaxy-condition run (millions, log scale), with the benchmarks in the order of panel a. Boxes span the middle 50% of runs and mark the median, which is printed at right; whiskers extend to 1.5 times the interquartile range; outliers are not shown (Supplementary Table 49; Extended Data Fig. 6).</w:t>
       </w:r>
     </w:p>
     <w:p>
@@ -172,7 +172,7 @@
         <w:t>Fig. 4 | Replicate agreement separates model configurations that run-level accuracy conflates.</w:t>
       </w:r>
       <w:r>
-        <w:t xml:space="preserve"> A replicate set is the three replicate runs of one task × model configuration × execution condition (Supplementary Note 8). </w:t>
+        <w:t xml:space="preserve"> A replicate set is the three replicate runs of one task × model configuration × execution condition (Supplementary Note 8). Panels a–c share rows and one segment order, all replicate runs succeed, split, none succeeds, and the benchmarks are in the order of Fig. 3a; split segments are coloured by execution condition. </w:t>
       </w:r>
       <w:r>
         <w:rPr>
@@ -181,7 +181,7 @@
         <w:t>a</w:t>
       </w:r>
       <w:r>
-        <w:t xml:space="preserve">, BixBench-Verified-50 replicate sets per model configuration and execution condition (50 tasks each): all three replicate runs scored correct (3/3), split (1–2/3) or none scored correct (0/3). The note under the panel gives the totals over all five model configurations (Supplementary Table 56). </w:t>
+        <w:t xml:space="preserve">, IWC replicate sets per model configuration and execution condition (10 tasks each): the three output-agreement values lie within 0.05 of each other, or the set is split (range above 0.05). IWC output agreement is continuous, so the 3/3 and 0/3 categories are not defined; every set within 0.05 had all three replicate runs at 0.918 or above. The GPT-5.5 open-ended code condition host-read removal runs were not scored, leaving 9 sets. The note gives the totals over the four model configurations (Supplementary Tables 8 and 44; Extended Data Fig. 5b). </w:t>
       </w:r>
       <w:r>
         <w:rPr>
@@ -190,7 +190,7 @@
         <w:t>b</w:t>
       </w:r>
       <w:r>
-        <w:t xml:space="preserve">, CompBioBench replicate sets by the number of distinct normalized answers among their three replicate runs (100 tasks per model configuration). This measures answer consistency, not correctness (Supplementary Tables 44 and 60). </w:t>
+        <w:t xml:space="preserve">, BixBench-Verified-50 replicate sets per model configuration and execution condition (50 tasks each): all three replicate runs scored correct (3/3), split (1–2/3) or none scored correct (0/3). The note under the panel gives the totals over all five model configurations (Supplementary Table 56). </w:t>
       </w:r>
       <w:r>
         <w:rPr>
@@ -199,13 +199,22 @@
         <w:t>c</w:t>
       </w:r>
       <w:r>
+        <w:t xml:space="preserve">, CompBioBench replicate sets on the 82 strong-consensus tasks, whose consensus answer was given by at least 20 of the 25 runs of the task: all three replicate runs matched the consensus answer (3/3), split (1–2/3) or none matched (0/3). The archive keeps no per-run grades, so the consensus answer stands in for the reference (consensus proxy; Supplementary Note 7). The note gives the totals over the four model configurations (Supplementary Table 44b,c). Answer consistency without reference to any answer, the number of distinct normalized answers per replicate set, is in Supplementary Tables 44d and 60. </w:t>
+      </w:r>
+      <w:r>
+        <w:rPr>
+          <w:b/>
+        </w:rPr>
+        <w:t>d</w:t>
+      </w:r>
+      <w:r>
         <w:t xml:space="preserve">, Divergence mechanism of every scored-incorrect replicate run in a split BixBench-Verified-50 replicate set (45 open-ended code condition, 36 Galaxy condition), identified by comparing its execution trace with those of its scored-correct siblings (Supplementary Table 48; Extended Data Fig. 5a). </w:t>
       </w:r>
       <w:r>
         <w:rPr>
           <w:b/>
         </w:rPr>
-        <w:t>d</w:t>
+        <w:t>e</w:t>
       </w:r>
       <w:r>
         <w:t>, BixBench-Verified-50 run-level accuracy (open symbols) and unanimous accuracy, the share of tasks with 3/3 replicate runs scored correct (filled symbols), per model configuration. The right column gives the Galaxy-condition difference, unanimous − run-level. The note gives the condition difference on both measures for the same pooled model configurations (Supplementary Table 56).</w:t>
@@ -399,7 +408,7 @@
         <w:t>a</w:t>
       </w:r>
       <w:r>
-        <w:t xml:space="preserve">, Divergence mechanisms of Fig. 4c by model configuration and execution condition; numbers at right give scored-incorrect replicate runs in split replicate sets (Supplementary Table 48). </w:t>
+        <w:t xml:space="preserve">, Divergence mechanisms of Fig. 4d by model configuration and execution condition; numbers at right give scored-incorrect replicate runs in split replicate sets (Supplementary Table 48). </w:t>
       </w:r>
       <w:r>
         <w:rPr>

</xml_diff>